<commit_message>
fixing echo = F
</commit_message>
<xml_diff>
--- a/07-anova-one-cat-eda/activity/multiple-comparisons-procedure/activity7b-multiple-comparison-procedure.docx
+++ b/07-anova-one-cat-eda/activity/multiple-comparisons-procedure/activity7b-multiple-comparison-procedure.docx
@@ -14,6 +14,18 @@
       </w:r>
       <w:r>
         <w:t xml:space="preserve">7B:</w:t>
+      </w:r>
+      <w:r>
+        <w:t xml:space="preserve"> </w:t>
+      </w:r>
+      <w:r>
+        <w:t xml:space="preserve">IMDb</w:t>
+      </w:r>
+      <w:r>
+        <w:t xml:space="preserve"> </w:t>
+      </w:r>
+      <w:r>
+        <w:t xml:space="preserve">III</w:t>
       </w:r>
     </w:p>
     <w:p>
@@ -1714,6 +1726,56 @@
       </w:pPr>
       <w:r>
         <w:t xml:space="preserve">Fill in the necessary components of the code below.</w:t>
+      </w:r>
+    </w:p>
+    <w:p>
+      <w:pPr>
+        <w:pStyle w:val="SourceCode"/>
+      </w:pPr>
+      <w:r>
+        <w:rPr>
+          <w:rStyle w:val="FunctionTok"/>
+        </w:rPr>
+        <w:t xml:space="preserve">aov</w:t>
+      </w:r>
+      <w:r>
+        <w:rPr>
+          <w:rStyle w:val="NormalTok"/>
+        </w:rPr>
+        <w:t xml:space="preserve">(_______________________________ </w:t>
+      </w:r>
+      <w:r>
+        <w:rPr>
+          <w:rStyle w:val="SpecialCharTok"/>
+        </w:rPr>
+        <w:t xml:space="preserve">~</w:t>
+      </w:r>
+      <w:r>
+        <w:rPr>
+          <w:rStyle w:val="NormalTok"/>
+        </w:rPr>
+        <w:t xml:space="preserve"> __________________________,</w:t>
+      </w:r>
+      <w:r>
+        <w:br/>
+      </w:r>
+      <w:r>
+        <w:rPr>
+          <w:rStyle w:val="NormalTok"/>
+        </w:rPr>
+        <w:t xml:space="preserve">    </w:t>
+      </w:r>
+      <w:r>
+        <w:rPr>
+          <w:rStyle w:val="AttributeTok"/>
+        </w:rPr>
+        <w:t xml:space="preserve">data =</w:t>
+      </w:r>
+      <w:r>
+        <w:rPr>
+          <w:rStyle w:val="NormalTok"/>
+        </w:rPr>
+        <w:t xml:space="preserve"> movie_ratings)</w:t>
       </w:r>
     </w:p>
     <w:p>

</xml_diff>